<commit_message>
Add cross-month expense comparison
- relay_server: expense_summary now returns last_month and last_month_by_category
- demo UI: show last month total next to this month
- docs: report, slides, scripts updated with cross-month comparison
</commit_message>
<xml_diff>
--- a/docs/專題報告.docx
+++ b/docs/專題報告.docx
@@ -142,7 +142,7 @@
           <w:color w:val="122019"/>
           <w:sz w:val="21"/>
         </w:rPr>
-        <w:t>實際測試中，記帳回覆約 0.3 秒；查資料暖機後一次約 5.5～5.9 秒；冷啟動約 16 秒；11 個單元測試全部通過。</w:t>
+        <w:t>實際測試中，記帳回覆約 0.3 秒；查資料暖機後一次約 5.5～5.9 秒；冷啟動約 16 秒；11 個單元測試全部通過。累計資料支援跨月比較（本月 vs 上個月）。</w:t>
       </w:r>
     </w:p>
     <w:p>
@@ -2058,7 +2058,24 @@
           <w:color w:val="122019"/>
           <w:sz w:val="21"/>
         </w:rPr>
-        <w:t>：回今日累計、本月累計與分類小計。</w:t>
+        <w:t>：回今日累計、本月累計、</w:t>
+      </w:r>
+      <w:r>
+        <w:rPr>
+          <w:rFonts w:ascii="Microsoft JhengHei" w:hAnsi="Microsoft JhengHei" w:eastAsia="Microsoft JhengHei"/>
+          <w:b/>
+          <w:color w:val="075F31"/>
+          <w:sz w:val="21"/>
+        </w:rPr>
+        <w:t>上個月累計</w:t>
+      </w:r>
+      <w:r>
+        <w:rPr>
+          <w:rFonts w:ascii="Microsoft JhengHei" w:hAnsi="Microsoft JhengHei" w:eastAsia="Microsoft JhengHei"/>
+          <w:color w:val="122019"/>
+          <w:sz w:val="21"/>
+        </w:rPr>
+        <w:t>與分類小計（含 last_month_by_category），可用來做跨月比較。</w:t>
       </w:r>
     </w:p>
     <w:p>
@@ -2080,7 +2097,7 @@
           <w:color w:val="122019"/>
           <w:sz w:val="21"/>
         </w:rPr>
-        <w:t>：組回覆文案：「已記帳 咖啡 45 元（飲食）｜今日累計…｜本月累計…」。</w:t>
+        <w:t>：組回覆文案：「已記帳 …｜今日累計…｜本月累計…（上個月累計…）」。</w:t>
       </w:r>
     </w:p>
     <w:p>

</xml_diff>